<commit_message>
feat(career): enforce single-CV application policy
</commit_message>
<xml_diff>
--- a/templates/cv/2026-08-03_Abdelhamid_Farah_CV_Template_Modern_Executive_Sidebar_v1.0.docx
+++ b/templates/cv/2026-08-03_Abdelhamid_Farah_CV_Template_Modern_Executive_Sidebar_v1.0.docx
@@ -880,7 +880,7 @@
                 <w:color w:val="52606C"/>
                 <w:sz w:val="14"/>
               </w:rPr>
-              <w:t>Riyadh, Saudi Arabia | +966 53 079 6449 | hameedfarah@gmail.com | linkedin.com/in/abd-farah</w:t>
+              <w:t>Riyadh, Saudi Arabia | +966 53 079 6449 | hameedo@gmail.com | linkedin.com/in/abd-farah</w:t>
             </w:r>
           </w:p>
           <w:p>
@@ -2099,7 +2099,7 @@
                 <w:color w:val="52606C"/>
                 <w:sz w:val="15"/>
               </w:rPr>
-              <w:t>hameedfarah@gmail.com</w:t>
+              <w:t>hameedo@gmail.com</w:t>
             </w:r>
           </w:p>
           <w:p>

</xml_diff>